<commit_message>
PR5: audit fixes (spoiler, complex pairs, synthetic division teaching, negative fraction and CheckIt factor forms, captions, renames), audit md, README row
Co-Authored-By: Claude Opus 5.5 <noreply@anthropic.com>
Claude-Session: https://claude.ai/code/session_013Y8PfETWcMLvmUEpCdE8Wq
</commit_message>
<xml_diff>
--- a/support-materials/PR5/PR5_worked_examples.docx
+++ b/support-materials/PR5/PR5_worked_examples.docx
@@ -605,7 +605,7 @@
           <wp:inline distT="0" distB="0" distL="0" distR="0">
             <wp:extent cx="3286125" cy="2476500"/>
             <wp:effectExtent t="0" r="0" b="0" l="0"/>
-            <wp:docPr id="1" name="cz3" descr="The graph of a quartic polynomial crossing the x-axis four times. Plotted data: A graph of y = f(x) on axes with x from −6 to 5 and y from −400 to 400, with tick marks every half unit on the x-axis. Coming down from the upper left, the graph crosses the x-axis a little left of −5, at about −5.2, falls to a low point near x = −4, and rises to cross again between −1 and −0.5, at about −0.8. It peaks just above the x-axis, at about 50, a little right of the y-axis, then falls to cross at x = 1.5, halfway between 1 and 2. It reaches a low point near x = 3 and rises to cross at x = 4, going up to the upper right." title="The graph of a quartic polynomial crossing the x-axis four times"/>
+            <wp:docPr id="1" name="cz3" descr="The graph of a quartic polynomial crossing the x-axis four times. Plotted data: A graph of y = f(x) on axes with x from −6 to 5 and y from −400 to 400, with tick marks every half unit on the x-axis. Coming down from the upper left, the graph crosses the x-axis a little left of −5, at about −5.2, falls to a low point at about (−3.7, −360), and rises to cross again between −1 and −0.5, at about −0.8. It peaks just above the x-axis, at about 50, a little right of the y-axis, then falls to cross at x = 1.5, halfway between 1 and 2. It reaches a low point at about (3, −90) and rises to cross at x = 4, going up to the upper right." title="The graph of a quartic polynomial crossing the x-axis four times"/>
             <wp:cNvGraphicFramePr>
               <a:graphicFrameLocks xmlns:a="http://schemas.openxmlformats.org/drawingml/2006/main" noChangeAspect="1"/>
             </wp:cNvGraphicFramePr>
@@ -659,7 +659,7 @@
           <w:sz w:val="22"/>
           <w:szCs w:val="22"/>
         </w:rPr>
-        <w:t xml:space="preserve">A graph of y = f(x) on axes with x from −6 to 5 and y from −400 to 400, with tick marks every half unit on the x-axis. Coming down from the upper left, the graph crosses the x-axis a little left of −5, at about −5.2, falls to a low point near x = −4, and rises to cross again between −1 and −0.5, at about −0.8. It peaks just above the x-axis, at about 50, a little right of the y-axis, then falls to cross at x = 1.5, halfway between 1 and 2. It reaches a low point near x = 3 and rises to cross at x = 4, going up to the upper right.</w:t>
+        <w:t xml:space="preserve">A graph of y = f(x) on axes with x from −6 to 5 and y from −400 to 400, with tick marks every half unit on the x-axis. Coming down from the upper left, the graph crosses the x-axis a little left of −5, at about −5.2, falls to a low point at about (−3.7, −360), and rises to cross again between −1 and −0.5, at about −0.8. It peaks just above the x-axis, at about 50, a little right of the y-axis, then falls to cross at x = 1.5, halfway between 1 and 2. It reaches a low point at about (3, −90) and rises to cross at x = 4, going up to the upper right.</w:t>
       </w:r>
     </w:p>
     <w:p>
@@ -754,7 +754,7 @@
         <w:spacing w:after="120" w:before="80" w:line="300"/>
       </w:pPr>
       <w:r>
-        <w:t xml:space="preserve">The candidates for f include ±1, ±2, ±3, ±4, ±6, ±8, ±1/2, and ±3/2. Which crossings sit exactly on candidates, so they are worth testing first?</w:t>
+        <w:t xml:space="preserve">The candidates for f include ±1, ±2, ±3, ±4, ±6, ±8, ±1/2, and ±3/2. Which crossings appear to land on candidates, so they are worth testing first?</w:t>
       </w:r>
     </w:p>
     <w:p>
@@ -845,17 +845,7 @@
         <w:t xml:space="preserve">3/2</w:t>
       </w:r>
       <w:r>
-        <w:t xml:space="preserve">: both are candidates, so test them first. The other two crossings, near −5.2 and −0.8, sit between candidates, so they are not rational zeros. They turn out to be </w:t>
-      </w:r>
-      <w:r>
-        <w:rPr>
-          <w:i/>
-          <w:iCs/>
-        </w:rPr>
-        <w:t xml:space="preserve">−3±√5</w:t>
-      </w:r>
-      <w:r>
-        <w:t xml:space="preserve">, which you find later with the quadratic formula. −5 is not even a candidate, since 5 does not divide 48, and −1 and −1/2 are close to a crossing but not on it. A graph tells you where to look; a remainder of 0 proves it. </w:t>
+        <w:t xml:space="preserve">: both are candidates, so test them first. The other two crossings, near −5.2 and −0.8, sit between candidates, so they are not rational zeros. They are irrational, and you find them later with the quadratic formula. −5 is not even a candidate, since 5 does not divide 48, and −1 and −1/2 are close to a crossing but not on it. A graph tells you where to look; a remainder of 0 proves it. </w:t>
       </w:r>
       <w:r>
         <w:rPr>
@@ -1125,7 +1115,7 @@
           <wp:inline distT="0" distB="0" distL="0" distR="0">
             <wp:extent cx="4762500" cy="1447800"/>
             <wp:effectExtent t="0" r="0" b="0" l="0"/>
-            <wp:docPr id="1" name="sd1" descr="A synthetic division in progress, with a box for the next number. Plotted data: A synthetic division in progress. The number being tested, 3, is in the corner box. The top row lists the coefficients: 1, negative 3, negative 23, 91, negative 6, negative 180. The middle row so far reads 3, 0, negative 69, then a box with a question mark under negative 6. The bottom row so far reads 1, 0, negative 23, 22." title="A synthetic division in progress, with a box for the next number"/>
+            <wp:docPr id="1" name="sd1" descr="A synthetic division in progress, with a box for the next number. Plotted data: A synthetic division in progress. The number being tested, 3, is in the corner box. The top row lists the coefficients: 1, negative 3, negative 23, 91, negative 6, negative 180. The middle row starts under the second coefficient, negative 3, and so far reads 3, 0, negative 69, then a box with a question mark under negative 6. The bottom row so far reads 1, 0, negative 23, 22." title="A synthetic division in progress, with a box for the next number"/>
             <wp:cNvGraphicFramePr>
               <a:graphicFrameLocks xmlns:a="http://schemas.openxmlformats.org/drawingml/2006/main" noChangeAspect="1"/>
             </wp:cNvGraphicFramePr>
@@ -1179,7 +1169,7 @@
           <w:sz w:val="22"/>
           <w:szCs w:val="22"/>
         </w:rPr>
-        <w:t xml:space="preserve">A synthetic division in progress. The number being tested, 3, is in the corner box. The top row lists the coefficients: 1, negative 3, negative 23, 91, negative 6, negative 180. The middle row so far reads 3, 0, negative 69, then a box with a question mark under negative 6. The bottom row so far reads 1, 0, negative 23, 22.</w:t>
+        <w:t xml:space="preserve">A synthetic division in progress. The number being tested, 3, is in the corner box. The top row lists the coefficients: 1, negative 3, negative 23, 91, negative 6, negative 180. The middle row starts under the second coefficient, negative 3, and so far reads 3, 0, negative 69, then a box with a question mark under negative 6. The bottom row so far reads 1, 0, negative 23, 22.</w:t>
       </w:r>
     </w:p>
     <w:p>
@@ -1330,7 +1320,7 @@
         <w:t xml:space="preserve">D.  </w:t>
       </w:r>
       <w:r>
-        <w:t xml:space="preserve">113</w:t>
+        <w:t xml:space="preserve">16</w:t>
       </w:r>
     </w:p>
     <w:p>
@@ -1367,17 +1357,27 @@
         <w:t xml:space="preserve">−6+66=60</w:t>
       </w:r>
       <w:r>
-        <w:t xml:space="preserve">. 25 adds 3 instead of multiplying; −66 flips the sign; and 113 is </w:t>
-      </w:r>
-      <w:r>
-        <w:rPr>
-          <w:i/>
-          <w:iCs/>
-        </w:rPr>
-        <w:t xml:space="preserve">91+22</w:t>
-      </w:r>
-      <w:r>
-        <w:t xml:space="preserve">, a sum written where the product goes. </w:t>
+        <w:t xml:space="preserve">. Keep going: </w:t>
+      </w:r>
+      <w:r>
+        <w:rPr>
+          <w:i/>
+          <w:iCs/>
+        </w:rPr>
+        <w:t xml:space="preserve">60· 3=180</w:t>
+      </w:r>
+      <w:r>
+        <w:t xml:space="preserve"> and </w:t>
+      </w:r>
+      <w:r>
+        <w:rPr>
+          <w:i/>
+          <w:iCs/>
+        </w:rPr>
+        <w:t xml:space="preserve">−180+180=0</w:t>
+      </w:r>
+      <w:r>
+        <w:t xml:space="preserve">. The last number is 0, so 3 is a zero of c. 25 adds 3 instead of multiplying; −66 flips the sign; and 16 adds 22 and −6, skipping the multiply step. </w:t>
       </w:r>
       <w:r>
         <w:rPr>
@@ -1405,7 +1405,7 @@
           <wp:inline distT="0" distB="0" distL="0" distR="0">
             <wp:extent cx="4762500" cy="1438275"/>
             <wp:effectExtent t="0" r="0" b="0" l="0"/>
-            <wp:docPr id="1" name="sd2" descr="A finished synthetic division. Plotted data: A finished synthetic division. The number being tested, 4, is in the corner box. The top row lists the coefficients of f: 1, 0, negative 3, negative 16, negative 108, negative 144. The middle row reads 4, 16, 52, 144, 144. The bottom row reads 1, 4, 13, 36, 36, 0." title="A finished synthetic division"/>
+            <wp:docPr id="1" name="sd2" descr="A finished synthetic division. Plotted data: A finished synthetic division. The number being tested, 4, is in the corner box. The top row lists the coefficients of r: 1, 0, negative 3, negative 16, negative 108, negative 144. The middle row starts under the second coefficient and reads 4, 16, 52, 144, 144. The bottom row reads 1, 4, 13, 36, 36, 0." title="A finished synthetic division"/>
             <wp:cNvGraphicFramePr>
               <a:graphicFrameLocks xmlns:a="http://schemas.openxmlformats.org/drawingml/2006/main" noChangeAspect="1"/>
             </wp:cNvGraphicFramePr>
@@ -1459,7 +1459,7 @@
           <w:sz w:val="22"/>
           <w:szCs w:val="22"/>
         </w:rPr>
-        <w:t xml:space="preserve">A finished synthetic division. The number being tested, 4, is in the corner box. The top row lists the coefficients of f: 1, 0, negative 3, negative 16, negative 108, negative 144. The middle row reads 4, 16, 52, 144, 144. The bottom row reads 1, 4, 13, 36, 36, 0.</w:t>
+        <w:t xml:space="preserve">A finished synthetic division. The number being tested, 4, is in the corner box. The top row lists the coefficients of r: 1, 0, negative 3, negative 16, negative 108, negative 144. The middle row starts under the second coefficient and reads 4, 16, 52, 144, 144. The bottom row reads 1, 4, 13, 36, 36, 0.</w:t>
       </w:r>
     </w:p>
     <w:p>
@@ -1483,7 +1483,7 @@
           <w:i/>
           <w:iCs/>
         </w:rPr>
-        <w:t xml:space="preserve">f(x)=x</w:t>
+        <w:t xml:space="preserve">r(x)=x</w:t>
       </w:r>
       <w:r>
         <w:rPr>
@@ -1573,7 +1573,7 @@
         <w:t xml:space="preserve">B.  </w:t>
       </w:r>
       <w:r>
-        <w:t xml:space="preserve">4 is a zero, and f(x) = (x + 4)(x⁴ + 4x³ + 13x² + 36x + 36).</w:t>
+        <w:t xml:space="preserve">4 is a zero, and r(x) = (x + 4)(x⁴ + 4x³ + 13x² + 36x + 36).</w:t>
       </w:r>
     </w:p>
     <w:p>
@@ -1589,7 +1589,7 @@
         <w:t xml:space="preserve">C.  </w:t>
       </w:r>
       <w:r>
-        <w:t xml:space="preserve">4 is a zero, and f(x) = (x − 4)(x⁵ + 4x⁴ + 13x³ + 36x² + 36x).</w:t>
+        <w:t xml:space="preserve">4 is a zero, and r(x) = (x − 4)(x⁵ + 4x⁴ + 13x³ + 36x² + 36x).</w:t>
       </w:r>
     </w:p>
     <w:p>
@@ -1605,7 +1605,7 @@
         <w:t xml:space="preserve">D.  </w:t>
       </w:r>
       <w:r>
-        <w:t xml:space="preserve">4 is a zero, and f(x) = (x − 4)(x⁴ + 4x³ + 13x² + 36x + 36).</w:t>
+        <w:t xml:space="preserve">4 is a zero, and r(x) = (x − 4)(x⁴ + 4x³ + 13x² + 36x + 36).</w:t>
       </w:r>
     </w:p>
     <w:p>
@@ -1629,7 +1629,7 @@
           <w:i/>
           <w:iCs/>
         </w:rPr>
-        <w:t xml:space="preserve">f(4)=0</w:t>
+        <w:t xml:space="preserve">r(4)=0</w:t>
       </w:r>
       <w:r>
         <w:t xml:space="preserve">: 4 is a zero and </w:t>
@@ -1741,7 +1741,7 @@
           <w:i/>
           <w:iCs/>
         </w:rPr>
-        <w:t xml:space="preserve">f(x)=(x−4)(x</w:t>
+        <w:t xml:space="preserve">r(x)=(x−4)(x</w:t>
       </w:r>
       <w:r>
         <w:rPr>
@@ -1826,7 +1826,7 @@
           <wp:inline distT="0" distB="0" distL="0" distR="0">
             <wp:extent cx="4762500" cy="1676400"/>
             <wp:effectExtent t="0" r="0" b="0" l="0"/>
-            <wp:docPr id="1" name="sd3" descr="A synthetic division of a quartic. Plotted data: A finished synthetic division. The number being tested, negative 2, is in the corner box. The top row lists the coefficients 1, 4, 13, 36, 36. The middle row reads negative 2, negative 4, negative 18, negative 36. The bottom row reads 1, 2, 9, 18, 0." title="A synthetic division of a quartic"/>
+            <wp:docPr id="1" name="sd3" descr="A synthetic division of a quartic. Plotted data: A finished synthetic division. The number being tested, negative 2, is in the corner box. The top row lists the coefficients 1, 4, 13, 36, 36. The middle row starts under the second coefficient and reads negative 2, negative 4, negative 18, negative 36. The bottom row reads 1, 2, 9, 18, 0." title="A synthetic division of a quartic"/>
             <wp:cNvGraphicFramePr>
               <a:graphicFrameLocks xmlns:a="http://schemas.openxmlformats.org/drawingml/2006/main" noChangeAspect="1"/>
             </wp:cNvGraphicFramePr>
@@ -1880,7 +1880,7 @@
           <w:sz w:val="22"/>
           <w:szCs w:val="22"/>
         </w:rPr>
-        <w:t xml:space="preserve">A finished synthetic division. The number being tested, negative 2, is in the corner box. The top row lists the coefficients 1, 4, 13, 36, 36. The middle row reads negative 2, negative 4, negative 18, negative 36. The bottom row reads 1, 2, 9, 18, 0.</w:t>
+        <w:t xml:space="preserve">A finished synthetic division. The number being tested, negative 2, is in the corner box. The top row lists the coefficients 1, 4, 13, 36, 36. The middle row starts under the second coefficient and reads negative 2, negative 4, negative 18, negative 36. The bottom row reads 1, 2, 9, 18, 0.</w:t>
       </w:r>
     </w:p>
     <w:p>
@@ -2083,26 +2083,74 @@
         <w:spacing w:after="120" w:before="80" w:line="300"/>
       </w:pPr>
       <w:r>
-        <w:rPr>
-          <w:i/>
-          <w:iCs/>
-        </w:rPr>
-        <w:t xml:space="preserve">(−2)</w:t>
-      </w:r>
-      <w:r>
-        <w:rPr>
-          <w:i/>
-          <w:iCs/>
-          <w:vertAlign w:val="superscript"/>
-        </w:rPr>
-        <w:t xml:space="preserve">3</w:t>
-      </w:r>
-      <w:r>
-        <w:rPr>
-          <w:i/>
-          <w:iCs/>
-        </w:rPr>
-        <w:t xml:space="preserve">+2(−2)</w:t>
+        <w:t xml:space="preserve">Divide again with −2: bring down 1; </w:t>
+      </w:r>
+      <w:r>
+        <w:rPr>
+          <w:i/>
+          <w:iCs/>
+        </w:rPr>
+        <w:t xml:space="preserve">1·(−2)=−2</w:t>
+      </w:r>
+      <w:r>
+        <w:t xml:space="preserve">, </w:t>
+      </w:r>
+      <w:r>
+        <w:rPr>
+          <w:i/>
+          <w:iCs/>
+        </w:rPr>
+        <w:t xml:space="preserve">2−2=0</w:t>
+      </w:r>
+      <w:r>
+        <w:t xml:space="preserve">; </w:t>
+      </w:r>
+      <w:r>
+        <w:rPr>
+          <w:i/>
+          <w:iCs/>
+        </w:rPr>
+        <w:t xml:space="preserve">0·(−2)=0</w:t>
+      </w:r>
+      <w:r>
+        <w:t xml:space="preserve">, </w:t>
+      </w:r>
+      <w:r>
+        <w:rPr>
+          <w:i/>
+          <w:iCs/>
+        </w:rPr>
+        <w:t xml:space="preserve">9+0=9</w:t>
+      </w:r>
+      <w:r>
+        <w:t xml:space="preserve">; </w:t>
+      </w:r>
+      <w:r>
+        <w:rPr>
+          <w:i/>
+          <w:iCs/>
+        </w:rPr>
+        <w:t xml:space="preserve">9·(−2)=−18</w:t>
+      </w:r>
+      <w:r>
+        <w:t xml:space="preserve">, </w:t>
+      </w:r>
+      <w:r>
+        <w:rPr>
+          <w:i/>
+          <w:iCs/>
+        </w:rPr>
+        <w:t xml:space="preserve">18−18=0</w:t>
+      </w:r>
+      <w:r>
+        <w:t xml:space="preserve">. The bottom row is 1, 0, 9, 0: remainder 0, and the quotient is </w:t>
+      </w:r>
+      <w:r>
+        <w:rPr>
+          <w:i/>
+          <w:iCs/>
+        </w:rPr>
+        <w:t xml:space="preserve">x</w:t>
       </w:r>
       <w:r>
         <w:rPr>
@@ -2117,10 +2165,25 @@
           <w:i/>
           <w:iCs/>
         </w:rPr>
-        <w:t xml:space="preserve">+9(−2)+18=−8+8−18+18=0</w:t>
-      </w:r>
-      <w:r>
-        <w:t xml:space="preserve">. So −2 works again: it is a zero with multiplicity 2, and </w:t>
+        <w:t xml:space="preserve">+0x+9=x</w:t>
+      </w:r>
+      <w:r>
+        <w:rPr>
+          <w:i/>
+          <w:iCs/>
+          <w:vertAlign w:val="superscript"/>
+        </w:rPr>
+        <w:t xml:space="preserve">2</w:t>
+      </w:r>
+      <w:r>
+        <w:rPr>
+          <w:i/>
+          <w:iCs/>
+        </w:rPr>
+        <w:t xml:space="preserve">+9</w:t>
+      </w:r>
+      <w:r>
+        <w:t xml:space="preserve">. So −2 is a zero with multiplicity 2, and </w:t>
       </w:r>
       <w:r>
         <w:rPr>
@@ -2138,32 +2201,7 @@
         <w:t xml:space="preserve">2</w:t>
       </w:r>
       <w:r>
-        <w:t xml:space="preserve"> is part of the factored form. What is left is </w:t>
-      </w:r>
-      <w:r>
-        <w:rPr>
-          <w:i/>
-          <w:iCs/>
-        </w:rPr>
-        <w:t xml:space="preserve">x</w:t>
-      </w:r>
-      <w:r>
-        <w:rPr>
-          <w:i/>
-          <w:iCs/>
-          <w:vertAlign w:val="superscript"/>
-        </w:rPr>
-        <w:t xml:space="preserve">2</w:t>
-      </w:r>
-      <w:r>
-        <w:rPr>
-          <w:i/>
-          <w:iCs/>
-        </w:rPr>
-        <w:t xml:space="preserve">+9</w:t>
-      </w:r>
-      <w:r>
-        <w:t xml:space="preserve">. 52 plugs in </w:t>
+        <w:t xml:space="preserve"> is part of the factored form. 52 plugs in </w:t>
       </w:r>
       <w:r>
         <w:rPr>
@@ -2219,9 +2257,9 @@
       <w:r>
         <w:drawing>
           <wp:inline distT="0" distB="0" distL="0" distR="0">
-            <wp:extent cx="4762500" cy="2019300"/>
+            <wp:extent cx="4762500" cy="2000250"/>
             <wp:effectExtent t="0" r="0" b="0" l="0"/>
-            <wp:docPr id="1" name="sd4" descr="A synthetic division by a fraction. Plotted data: A finished synthetic division. The number being tested, 2/3, is in the corner box. The top row lists the coefficients 3, 4, negative 16, 8. The middle row reads 2, 4, negative 8. The bottom row reads 3, 6, negative 12, 0." title="A synthetic division by a fraction"/>
+            <wp:docPr id="1" name="sd4" descr="A synthetic division by a fraction. Plotted data: A finished synthetic division. The number being tested, 2/3, is in the corner box. The top row lists the coefficients 3, 4, negative 16, 8. The middle row starts under the second coefficient and reads 2, 4, negative 8. The bottom row reads 3, 6, negative 12, 0." title="A synthetic division by a fraction"/>
             <wp:cNvGraphicFramePr>
               <a:graphicFrameLocks xmlns:a="http://schemas.openxmlformats.org/drawingml/2006/main" noChangeAspect="1"/>
             </wp:cNvGraphicFramePr>
@@ -2244,7 +2282,7 @@
                   <pic:spPr bwMode="auto">
                     <a:xfrm>
                       <a:off x="0" y="0"/>
-                      <a:ext cx="4762500" cy="2019300"/>
+                      <a:ext cx="4762500" cy="2000250"/>
                     </a:xfrm>
                     <a:prstGeom prst="rect">
                       <a:avLst/>
@@ -2275,7 +2313,7 @@
           <w:sz w:val="22"/>
           <w:szCs w:val="22"/>
         </w:rPr>
-        <w:t xml:space="preserve">A finished synthetic division. The number being tested, 2/3, is in the corner box. The top row lists the coefficients 3, 4, negative 16, 8. The middle row reads 2, 4, negative 8. The bottom row reads 3, 6, negative 12, 0.</w:t>
+        <w:t xml:space="preserve">A finished synthetic division. The number being tested, 2/3, is in the corner box. The top row lists the coefficients 3, 4, negative 16, 8. The middle row starts under the second coefficient and reads 2, 4, negative 8. The bottom row reads 3, 6, negative 12, 0.</w:t>
       </w:r>
     </w:p>
     <w:p>
@@ -2638,27 +2676,27 @@
           <w:i/>
           <w:iCs/>
         </w:rPr>
+        <w:t xml:space="preserve">−3±√5</w:t>
+      </w:r>
+    </w:p>
+    <w:p>
+      <w:pPr>
+        <w:spacing w:after="40" w:before="20"/>
+        <w:ind w:left="360"/>
+      </w:pPr>
+      <w:r>
+        <w:rPr>
+          <w:b/>
+          <w:bCs/>
+        </w:rPr>
+        <w:t xml:space="preserve">B.  </w:t>
+      </w:r>
+      <w:r>
+        <w:rPr>
+          <w:i/>
+          <w:iCs/>
+        </w:rPr>
         <w:t xml:space="preserve">3±√5</w:t>
-      </w:r>
-    </w:p>
-    <w:p>
-      <w:pPr>
-        <w:spacing w:after="40" w:before="20"/>
-        <w:ind w:left="360"/>
-      </w:pPr>
-      <w:r>
-        <w:rPr>
-          <w:b/>
-          <w:bCs/>
-        </w:rPr>
-        <w:t xml:space="preserve">B.  </w:t>
-      </w:r>
-      <w:r>
-        <w:rPr>
-          <w:i/>
-          <w:iCs/>
-        </w:rPr>
-        <w:t xml:space="preserve">−3±√5</w:t>
       </w:r>
     </w:p>
     <w:p>
@@ -2752,7 +2790,7 @@
           <w:i/>
           <w:iCs/>
         </w:rPr>
-        <w:t xml:space="preserve">√13</w:t>
+        <w:t xml:space="preserve">−3±√13</w:t>
       </w:r>
       <w:r>
         <w:t xml:space="preserve"> comes from </w:t>
@@ -2762,7 +2800,7 @@
           <w:i/>
           <w:iCs/>
         </w:rPr>
-        <w:t xml:space="preserve">36+16</w:t>
+        <w:t xml:space="preserve">√(36+16)=√52=2√13</w:t>
       </w:r>
       <w:r>
         <w:t xml:space="preserve">, getting the sign of </w:t>
@@ -3076,7 +3114,32 @@
         <w:t xml:space="preserve">−81</w:t>
       </w:r>
       <w:r>
-        <w:t xml:space="preserve">; and "no zeros" is true only for real zeros. The graph never crosses the </w:t>
+        <w:t xml:space="preserve">; and "no zeros" is true only for real zeros. The graph of </w:t>
+      </w:r>
+      <w:r>
+        <w:rPr>
+          <w:i/>
+          <w:iCs/>
+        </w:rPr>
+        <w:t xml:space="preserve">y=x</w:t>
+      </w:r>
+      <w:r>
+        <w:rPr>
+          <w:i/>
+          <w:iCs/>
+          <w:vertAlign w:val="superscript"/>
+        </w:rPr>
+        <w:t xml:space="preserve">2</w:t>
+      </w:r>
+      <w:r>
+        <w:rPr>
+          <w:i/>
+          <w:iCs/>
+        </w:rPr>
+        <w:t xml:space="preserve">+9</w:t>
+      </w:r>
+      <w:r>
+        <w:t xml:space="preserve"> never crosses the </w:t>
       </w:r>
       <w:r>
         <w:rPr>
@@ -3086,7 +3149,7 @@
         <w:t xml:space="preserve">x</w:t>
       </w:r>
       <w:r>
-        <w:t xml:space="preserve">-axis there, but the complex zeros exist, and CheckIt wants them. </w:t>
+        <w:t xml:space="preserve">-axis, but the complex zeros exist, and CheckIt wants them. </w:t>
       </w:r>
       <w:r>
         <w:rPr>
@@ -3280,92 +3343,92 @@
           <w:i/>
           <w:iCs/>
         </w:rPr>
+        <w:t xml:space="preserve">(x+3)(x−5)</w:t>
+      </w:r>
+      <w:r>
+        <w:rPr>
+          <w:i/>
+          <w:iCs/>
+          <w:vertAlign w:val="superscript"/>
+        </w:rPr>
+        <w:t xml:space="preserve">2</w:t>
+      </w:r>
+      <w:r>
+        <w:rPr>
+          <w:i/>
+          <w:iCs/>
+        </w:rPr>
+        <w:t xml:space="preserve">(x−2i)(x+2i)</w:t>
+      </w:r>
+    </w:p>
+    <w:p>
+      <w:pPr>
+        <w:spacing w:after="40" w:before="20"/>
+        <w:ind w:left="360"/>
+      </w:pPr>
+      <w:r>
+        <w:rPr>
+          <w:b/>
+          <w:bCs/>
+        </w:rPr>
+        <w:t xml:space="preserve">C.  </w:t>
+      </w:r>
+      <w:r>
+        <w:rPr>
+          <w:i/>
+          <w:iCs/>
+        </w:rPr>
+        <w:t xml:space="preserve">(x+3)(x−5)</w:t>
+      </w:r>
+      <w:r>
+        <w:rPr>
+          <w:i/>
+          <w:iCs/>
+          <w:vertAlign w:val="superscript"/>
+        </w:rPr>
+        <w:t xml:space="preserve">2</w:t>
+      </w:r>
+      <w:r>
+        <w:rPr>
+          <w:i/>
+          <w:iCs/>
+        </w:rPr>
+        <w:t xml:space="preserve">(x</w:t>
+      </w:r>
+      <w:r>
+        <w:rPr>
+          <w:i/>
+          <w:iCs/>
+          <w:vertAlign w:val="superscript"/>
+        </w:rPr>
+        <w:t xml:space="preserve">2</w:t>
+      </w:r>
+      <w:r>
+        <w:rPr>
+          <w:i/>
+          <w:iCs/>
+        </w:rPr>
+        <w:t xml:space="preserve">+4)</w:t>
+      </w:r>
+    </w:p>
+    <w:p>
+      <w:pPr>
+        <w:spacing w:after="40" w:before="20"/>
+        <w:ind w:left="360"/>
+      </w:pPr>
+      <w:r>
+        <w:rPr>
+          <w:b/>
+          <w:bCs/>
+        </w:rPr>
+        <w:t xml:space="preserve">D.  </w:t>
+      </w:r>
+      <w:r>
+        <w:rPr>
+          <w:i/>
+          <w:iCs/>
+        </w:rPr>
         <w:t xml:space="preserve">(x+3)(x−5)(x−2i)(x+2i)</w:t>
-      </w:r>
-    </w:p>
-    <w:p>
-      <w:pPr>
-        <w:spacing w:after="40" w:before="20"/>
-        <w:ind w:left="360"/>
-      </w:pPr>
-      <w:r>
-        <w:rPr>
-          <w:b/>
-          <w:bCs/>
-        </w:rPr>
-        <w:t xml:space="preserve">C.  </w:t>
-      </w:r>
-      <w:r>
-        <w:rPr>
-          <w:i/>
-          <w:iCs/>
-        </w:rPr>
-        <w:t xml:space="preserve">(x+3)(x−5)</w:t>
-      </w:r>
-      <w:r>
-        <w:rPr>
-          <w:i/>
-          <w:iCs/>
-          <w:vertAlign w:val="superscript"/>
-        </w:rPr>
-        <w:t xml:space="preserve">2</w:t>
-      </w:r>
-      <w:r>
-        <w:rPr>
-          <w:i/>
-          <w:iCs/>
-        </w:rPr>
-        <w:t xml:space="preserve">(x</w:t>
-      </w:r>
-      <w:r>
-        <w:rPr>
-          <w:i/>
-          <w:iCs/>
-          <w:vertAlign w:val="superscript"/>
-        </w:rPr>
-        <w:t xml:space="preserve">2</w:t>
-      </w:r>
-      <w:r>
-        <w:rPr>
-          <w:i/>
-          <w:iCs/>
-        </w:rPr>
-        <w:t xml:space="preserve">+4)</w:t>
-      </w:r>
-    </w:p>
-    <w:p>
-      <w:pPr>
-        <w:spacing w:after="40" w:before="20"/>
-        <w:ind w:left="360"/>
-      </w:pPr>
-      <w:r>
-        <w:rPr>
-          <w:b/>
-          <w:bCs/>
-        </w:rPr>
-        <w:t xml:space="preserve">D.  </w:t>
-      </w:r>
-      <w:r>
-        <w:rPr>
-          <w:i/>
-          <w:iCs/>
-        </w:rPr>
-        <w:t xml:space="preserve">(x+3)(x−5)</w:t>
-      </w:r>
-      <w:r>
-        <w:rPr>
-          <w:i/>
-          <w:iCs/>
-          <w:vertAlign w:val="superscript"/>
-        </w:rPr>
-        <w:t xml:space="preserve">2</w:t>
-      </w:r>
-      <w:r>
-        <w:rPr>
-          <w:i/>
-          <w:iCs/>
-        </w:rPr>
-        <w:t xml:space="preserve">(x−2i)(x+2i)</w:t>
       </w:r>
     </w:p>
     <w:p>
@@ -3640,47 +3703,47 @@
         <w:t xml:space="preserve">A.  </w:t>
       </w:r>
       <w:r>
+        <w:t xml:space="preserve">−5</w:t>
+      </w:r>
+    </w:p>
+    <w:p>
+      <w:pPr>
+        <w:spacing w:after="40" w:before="20"/>
+        <w:ind w:left="360"/>
+      </w:pPr>
+      <w:r>
+        <w:rPr>
+          <w:b/>
+          <w:bCs/>
+        </w:rPr>
+        <w:t xml:space="preserve">B.  </w:t>
+      </w:r>
+      <w:r>
+        <w:rPr>
+          <w:i/>
+          <w:iCs/>
+        </w:rPr>
+        <w:t xml:space="preserve">√(−16)</w:t>
+      </w:r>
+    </w:p>
+    <w:p>
+      <w:pPr>
+        <w:spacing w:after="40" w:before="20"/>
+        <w:ind w:left="360"/>
+      </w:pPr>
+      <w:r>
+        <w:rPr>
+          <w:b/>
+          <w:bCs/>
+        </w:rPr>
+        <w:t xml:space="preserve">C.  </w:t>
+      </w:r>
+      <w:r>
         <w:rPr>
           <w:i/>
           <w:iCs/>
         </w:rPr>
         <w:t xml:space="preserve">−4i</w:t>
-      </w:r>
-    </w:p>
-    <w:p>
-      <w:pPr>
-        <w:spacing w:after="40" w:before="20"/>
-        <w:ind w:left="360"/>
-      </w:pPr>
-      <w:r>
-        <w:rPr>
-          <w:b/>
-          <w:bCs/>
-        </w:rPr>
-        <w:t xml:space="preserve">B.  </w:t>
-      </w:r>
-      <w:r>
-        <w:rPr>
-          <w:i/>
-          <w:iCs/>
-        </w:rPr>
-        <w:t xml:space="preserve">√(−16)</w:t>
-      </w:r>
-    </w:p>
-    <w:p>
-      <w:pPr>
-        <w:spacing w:after="40" w:before="20"/>
-        <w:ind w:left="360"/>
-      </w:pPr>
-      <w:r>
-        <w:rPr>
-          <w:b/>
-          <w:bCs/>
-        </w:rPr>
-        <w:t xml:space="preserve">C.  </w:t>
-      </w:r>
-      <w:r>
-        <w:t xml:space="preserve">−5</w:t>
       </w:r>
     </w:p>
     <w:p>
@@ -3720,7 +3783,7 @@
           <w:i/>
           <w:iCs/>
         </w:rPr>
-        <w:t xml:space="preserve">±</w:t>
+        <w:t xml:space="preserve">a± bi</w:t>
       </w:r>
       <w:r>
         <w:t xml:space="preserve">: </w:t>
@@ -4080,9 +4143,9 @@
       <w:r>
         <w:drawing>
           <wp:inline distT="0" distB="0" distL="0" distR="0">
-            <wp:extent cx="4762500" cy="1438275"/>
+            <wp:extent cx="4762500" cy="1447800"/>
             <wp:effectExtent t="0" r="0" b="0" l="0"/>
-            <wp:docPr id="1" name="sl2" descr="A student's synthetic division. Plotted data: A student's synthetic division. The number in the corner box is 3. The top row lists the coefficients 1, negative 5, negative 6, 46, negative 32, negative 24. The middle row reads 3, negative 6, negative 36, 30, negative 6. The bottom row reads 1, negative 2, negative 12, 10, negative 2, negative 30." title="A student's synthetic division"/>
+            <wp:docPr id="1" name="sl2" descr="A student's synthetic division. Plotted data: A student's synthetic division. The number in the corner box is 3. The top row lists the coefficients 1, negative 5, negative 6, 46, negative 32, negative 24. The middle row starts under the second coefficient and reads 3, negative 6, negative 36, 30, negative 6. The bottom row reads 1, negative 2, negative 12, 10, negative 2, negative 30." title="A student's synthetic division"/>
             <wp:cNvGraphicFramePr>
               <a:graphicFrameLocks xmlns:a="http://schemas.openxmlformats.org/drawingml/2006/main" noChangeAspect="1"/>
             </wp:cNvGraphicFramePr>
@@ -4105,7 +4168,7 @@
                   <pic:spPr bwMode="auto">
                     <a:xfrm>
                       <a:off x="0" y="0"/>
-                      <a:ext cx="4762500" cy="1438275"/>
+                      <a:ext cx="4762500" cy="1447800"/>
                     </a:xfrm>
                     <a:prstGeom prst="rect">
                       <a:avLst/>
@@ -4136,7 +4199,7 @@
           <w:sz w:val="22"/>
           <w:szCs w:val="22"/>
         </w:rPr>
-        <w:t xml:space="preserve">A student's synthetic division. The number in the corner box is 3. The top row lists the coefficients 1, negative 5, negative 6, 46, negative 32, negative 24. The middle row reads 3, negative 6, negative 36, 30, negative 6. The bottom row reads 1, negative 2, negative 12, 10, negative 2, negative 30.</w:t>
+        <w:t xml:space="preserve">A student's synthetic division. The number in the corner box is 3. The top row lists the coefficients 1, negative 5, negative 6, 46, negative 32, negative 24. The middle row starts under the second coefficient and reads 3, negative 6, negative 36, 30, negative 6. The bottom row reads 1, negative 2, negative 12, 10, negative 2, negative 30.</w:t>
       </w:r>
     </w:p>
     <w:p>
@@ -4151,7 +4214,7 @@
           <w:sz w:val="40"/>
           <w:szCs w:val="40"/>
         </w:rPr>
-        <w:t xml:space="preserve">g(x)=x</w:t>
+        <w:t xml:space="preserve">m(x)=x</w:t>
       </w:r>
       <w:r>
         <w:rPr>
@@ -4260,7 +4323,7 @@
         <w:t xml:space="preserve">x+3</w:t>
       </w:r>
       <w:r>
-        <w:t xml:space="preserve"> is a factor of g. They did this synthetic division and concluded it is not, since the last number is −30. What is the mistake, if any?</w:t>
+        <w:t xml:space="preserve"> is a factor of m. They did this synthetic division and concluded it is not, since the last number is −30. What is the mistake, if any?</w:t>
       </w:r>
     </w:p>
     <w:p>
@@ -4308,7 +4371,7 @@
         <w:t xml:space="preserve">C.  </w:t>
       </w:r>
       <w:r>
-        <w:t xml:space="preserve">The last number is −30, so −30 is a zero of g instead.</w:t>
+        <w:t xml:space="preserve">The last number is −30, so −30 is a zero of m instead.</w:t>
       </w:r>
     </w:p>
     <w:p>
@@ -4398,7 +4461,7 @@
           <w:i/>
           <w:iCs/>
         </w:rPr>
-        <w:t xml:space="preserve">g(3)=−30</w:t>
+        <w:t xml:space="preserve">m(3)=−30</w:t>
       </w:r>
       <w:r>
         <w:t xml:space="preserve">, not a zero, and 3 is a possible rational zero, since 3 divides 24. </w:t>
@@ -4432,7 +4495,7 @@
           <w:sz w:val="40"/>
           <w:szCs w:val="40"/>
         </w:rPr>
-        <w:t xml:space="preserve">h(x)=(x+2)(3x−5)</w:t>
+        <w:t xml:space="preserve">w(x)=(x−3)(3x+5)</w:t>
       </w:r>
     </w:p>
     <w:p>
@@ -4471,7 +4534,7 @@
           <w:i/>
           <w:iCs/>
         </w:rPr>
-        <w:t xml:space="preserve">h(x)=3x</w:t>
+        <w:t xml:space="preserve">w(x)=3x</w:t>
       </w:r>
       <w:r>
         <w:rPr>
@@ -4486,7 +4549,7 @@
           <w:i/>
           <w:iCs/>
         </w:rPr>
-        <w:t xml:space="preserve">+x</w:t>
+        <w:t xml:space="preserve">−4x</w:t>
       </w:r>
       <w:r>
         <w:rPr>
@@ -4501,7 +4564,7 @@
           <w:i/>
           <w:iCs/>
         </w:rPr>
-        <w:t xml:space="preserve">+2x</w:t>
+        <w:t xml:space="preserve">−3x</w:t>
       </w:r>
       <w:r>
         <w:rPr>
@@ -4516,10 +4579,10 @@
           <w:i/>
           <w:iCs/>
         </w:rPr>
-        <w:t xml:space="preserve">+4x−40</w:t>
-      </w:r>
-      <w:r>
-        <w:t xml:space="preserve">, a student found the zeros −2, 5/3, 2i, and −2i, and wrote h as shown. What is the mistake, if any?</w:t>
+        <w:t xml:space="preserve">−16x−60</w:t>
+      </w:r>
+      <w:r>
+        <w:t xml:space="preserve">, a student found the zeros 3, −5/3, 2i, and −2i, and wrote w as shown. What is the mistake, if any?</w:t>
       </w:r>
     </w:p>
     <w:p>
@@ -4551,7 +4614,7 @@
         <w:t xml:space="preserve">B.  </w:t>
       </w:r>
       <w:r>
-        <w:t xml:space="preserve">The zero 5/3 needs the factor (x − 5/3), not (3x − 5).</w:t>
+        <w:t xml:space="preserve">The zero −5/3 needs the factor (x + 5/3), not (3x + 5).</w:t>
       </w:r>
     </w:p>
     <w:p>
@@ -4583,7 +4646,7 @@
         <w:t xml:space="preserve">D.  </w:t>
       </w:r>
       <w:r>
-        <w:t xml:space="preserve">The factor that goes with −2 should be (x − 2).</w:t>
+        <w:t xml:space="preserve">The factor that goes with 3 should be (x + 3).</w:t>
       </w:r>
     </w:p>
     <w:p>
@@ -4632,7 +4695,7 @@
           <w:i/>
           <w:iCs/>
         </w:rPr>
-        <w:t xml:space="preserve">(x+2)(3x−5)(x</w:t>
+        <w:t xml:space="preserve">(x−3)(3x+5)(x</w:t>
       </w:r>
       <w:r>
         <w:rPr>
@@ -4662,7 +4725,7 @@
           <w:i/>
           <w:iCs/>
         </w:rPr>
-        <w:t xml:space="preserve">+x</w:t>
+        <w:t xml:space="preserve">−4x</w:t>
       </w:r>
       <w:r>
         <w:rPr>
@@ -4677,7 +4740,7 @@
           <w:i/>
           <w:iCs/>
         </w:rPr>
-        <w:t xml:space="preserve">+2x</w:t>
+        <w:t xml:space="preserve">−3x</w:t>
       </w:r>
       <w:r>
         <w:rPr>
@@ -4692,7 +4755,7 @@
           <w:i/>
           <w:iCs/>
         </w:rPr>
-        <w:t xml:space="preserve">+4x−40</w:t>
+        <w:t xml:space="preserve">−16x−60</w:t>
       </w:r>
       <w:r>
         <w:t xml:space="preserve">. The factor </w:t>
@@ -4702,27 +4765,37 @@
           <w:i/>
           <w:iCs/>
         </w:rPr>
-        <w:t xml:space="preserve">(3x−5)</w:t>
-      </w:r>
-      <w:r>
-        <w:t xml:space="preserve"> carries the leading coefficient 3; </w:t>
-      </w:r>
-      <w:r>
-        <w:rPr>
-          <w:i/>
-          <w:iCs/>
-        </w:rPr>
-        <w:t xml:space="preserve">(x−5/3)</w:t>
-      </w:r>
-      <w:r>
-        <w:t xml:space="preserve"> alone would give leading coefficient 1. The complex zeros count, and −2 goes with </w:t>
-      </w:r>
-      <w:r>
-        <w:rPr>
-          <w:i/>
-          <w:iCs/>
-        </w:rPr>
-        <w:t xml:space="preserve">(x+2)</w:t>
+        <w:t xml:space="preserve">(3x+5)</w:t>
+      </w:r>
+      <w:r>
+        <w:t xml:space="preserve"> goes with the zero </w:t>
+      </w:r>
+      <w:r>
+        <w:rPr>
+          <w:i/>
+          <w:iCs/>
+        </w:rPr>
+        <w:t xml:space="preserve">−5/3</w:t>
+      </w:r>
+      <w:r>
+        <w:t xml:space="preserve"> and carries the leading coefficient 3; </w:t>
+      </w:r>
+      <w:r>
+        <w:rPr>
+          <w:i/>
+          <w:iCs/>
+        </w:rPr>
+        <w:t xml:space="preserve">(x+5/3)</w:t>
+      </w:r>
+      <w:r>
+        <w:t xml:space="preserve"> alone would give leading coefficient 1. The complex zeros count, and 3 goes with </w:t>
+      </w:r>
+      <w:r>
+        <w:rPr>
+          <w:i/>
+          <w:iCs/>
+        </w:rPr>
+        <w:t xml:space="preserve">(x−3)</w:t>
       </w:r>
       <w:r>
         <w:t xml:space="preserve">. </w:t>
@@ -4949,7 +5022,17 @@
         <w:t xml:space="preserve">(4± 2√6)/2=2±√6</w:t>
       </w:r>
       <w:r>
-        <w:t xml:space="preserve">. Halving the 24 inside the root is not the same thing. The discriminant uses </w:t>
+        <w:t xml:space="preserve">. Halving the 24 inside the root is not the same thing. Sometimes a number stays in front of the root: </w:t>
+      </w:r>
+      <w:r>
+        <w:rPr>
+          <w:i/>
+          <w:iCs/>
+        </w:rPr>
+        <w:t xml:space="preserve">(−4± 4√2)/2=−2± 2√2</w:t>
+      </w:r>
+      <w:r>
+        <w:t xml:space="preserve">. The discriminant uses </w:t>
       </w:r>
       <w:r>
         <w:rPr>
@@ -5295,7 +5378,17 @@
         <w:t xml:space="preserve">−1−√5</w:t>
       </w:r>
       <w:r>
-        <w:t xml:space="preserve">. </w:t>
+        <w:t xml:space="preserve">. CheckIt's answer key writes these with the inner parentheses removed, </w:t>
+      </w:r>
+      <w:r>
+        <w:rPr>
+          <w:i/>
+          <w:iCs/>
+        </w:rPr>
+        <w:t xml:space="preserve">(x−1−√5)(x−1+√5)</w:t>
+      </w:r>
+      <w:r>
+        <w:t xml:space="preserve">: the same factors. </w:t>
       </w:r>
       <w:r>
         <w:rPr>

</xml_diff>